<commit_message>
docs: Update Fraud_Detection_System_Capabilities_and_Architecture.docx with dual workflow options
</commit_message>
<xml_diff>
--- a/Fraud_Detection_System_Capabilities_and_Architecture.docx
+++ b/Fraud_Detection_System_Capabilities_and_Architecture.docx
@@ -16,7 +16,7 @@
         </w:rPr>
         <w:t>Enterprise Fraud Detection System:</w:t>
         <w:br/>
-        <w:t>System Capabilities &amp; Technical Architecture</w:t>
+        <w:t>Dual Execution Workflows &amp; Capabilities</w:t>
       </w:r>
     </w:p>
     <w:p>
@@ -31,7 +31,7 @@
           <w:color w:val="666666"/>
           <w:sz w:val="24"/>
         </w:rPr>
-        <w:t>Adey Innovations Inc. | Production System Technical Documentation</w:t>
+        <w:t>Adey Innovations Inc. | Dual-Workflow Technical Specification</w:t>
       </w:r>
     </w:p>
     <w:p>
@@ -46,7 +46,7 @@
           <w:color w:val="1B365D"/>
           <w:sz w:val="36"/>
         </w:rPr>
-        <w:t>1. Executive Summary</w:t>
+        <w:t>1. Executive Summary &amp; Dual-Workflow Concept</w:t>
       </w:r>
     </w:p>
     <w:p>
@@ -54,7 +54,7 @@
         <w:spacing w:after="200" w:line="276" w:lineRule="auto"/>
       </w:pPr>
       <w:r>
-        <w:t>This document presents the complete technical architecture and operational capabilities of the production-grade Fraud Detection System built for Adey Innovations Inc. The system operates across e-commerce and banking payment channels, providing real-time transaction scoring, automated decisioning, model explainability, and multi-channel monitoring.</w:t>
+        <w:t>This document details the system capabilities and dual execution workflows for the Adey Innovations Inc. Fraud Detection System. The architecture is structured into two completely independent, user-selectable execution modes: Option 1 (Standard Local ML Pipeline) for fast offline training and validation, and Option 2 (Enterprise Production Stack) for containerized microservices, API security, data drift monitoring, online feature store, and analyst feedback loops.</w:t>
       </w:r>
     </w:p>
     <w:tbl>
@@ -94,7 +94,7 @@
                 <w:color w:val="1B365D"/>
                 <w:sz w:val="22"/>
               </w:rPr>
-              <w:t>📌 Core Production Capabilities</w:t>
+              <w:t>📌 Two Independent User-Selectable Workflows</w:t>
               <w:br/>
             </w:r>
             <w:r>
@@ -102,17 +102,14 @@
                 <w:color w:val="222222"/>
                 <w:sz w:val="21"/>
               </w:rPr>
-              <w:t>• Zero Data-Leakage Training: SMOTE resampling is applied strictly to training splits (X_train) after train-test splitting.</w:t>
+              <w:t>• OPTION 1: Standard ML Pipeline (Fast Local Execution)</w:t>
               <w:br/>
-              <w:t>• Domain Signal Feature Engineering: Point-in-time calculation of transaction velocity (spending_speed), account age (time_since_signup), and explicit business flags (is_new_user, is_rapid_spender, is_high_value).</w:t>
+              <w:t xml:space="preserve">  Designed for rapid local development, feature engineering, standard leakage-proof training, pytest execution, and lightweight Streamlit exploration without requiring Docker or security setup.</w:t>
               <w:br/>
-              <w:t>• Automated Fraud Decision Engine: Combines ML risk scores with hard business rules to output ALLOW, REVIEW, or BLOCK decisions with standardized reason codes and risk bands (LOW, MEDIUM, HIGH, CRITICAL).</w:t>
               <w:br/>
-              <w:t>• Real-Time REST API Serving: FastAPI microservice exposing /predict, /predict/batch, and health monitoring endpoints.</w:t>
+              <w:t>• OPTION 2: Enterprise Production Stack (Docker + API Auth + Drift + Redis)</w:t>
               <w:br/>
-              <w:t>• Multi-Page Interactive Dashboard: Streamlit control application featuring dataset caching (@st.cache_data), live CSV upload scoring, transaction inspection, and SHAP risk factor plots.</w:t>
-              <w:br/>
-              <w:t>• Automated Pytest Validation Suite: 100% passing test suite covering data validation, preprocessing, feature extraction, decision rules, and API endpoints.</w:t>
+              <w:t xml:space="preserve">  Designed for full enterprise production deployment featuring multi-container Docker Compose orchestration, FastAPI API Key security (X-API-Key), SHA-256 PII hashing, Population Stability Index (PSI) data drift monitoring, Feast/Redis feature store client, and active learning analyst feedback loops.</w:t>
             </w:r>
           </w:p>
         </w:tc>
@@ -135,7 +132,7 @@
           <w:color w:val="1B365D"/>
           <w:sz w:val="36"/>
         </w:rPr>
-        <w:t>2. System Architecture &amp; Core Modules</w:t>
+        <w:t>2. Workflow Comparison Matrix</w:t>
       </w:r>
     </w:p>
     <w:tbl>
@@ -172,7 +169,7 @@
                 <w:color w:val="FFFFFF"/>
                 <w:sz w:val="19"/>
               </w:rPr>
-              <w:t>Subsystem Layer</w:t>
+              <w:t>System Component</w:t>
             </w:r>
           </w:p>
         </w:tc>
@@ -197,7 +194,7 @@
                 <w:color w:val="FFFFFF"/>
                 <w:sz w:val="19"/>
               </w:rPr>
-              <w:t>Module Location</w:t>
+              <w:t>Option 1: Standard ML Pipeline</w:t>
             </w:r>
           </w:p>
         </w:tc>
@@ -222,7 +219,7 @@
                 <w:color w:val="FFFFFF"/>
                 <w:sz w:val="19"/>
               </w:rPr>
-              <w:t>Key Production Functionality</w:t>
+              <w:t>Option 2: Enterprise Production Stack</w:t>
             </w:r>
           </w:p>
         </w:tc>
@@ -245,7 +242,7 @@
                 <w:color w:val="333333"/>
                 <w:sz w:val="18"/>
               </w:rPr>
-              <w:t>Central Configuration</w:t>
+              <w:t>Execution Command</w:t>
             </w:r>
           </w:p>
         </w:tc>
@@ -266,7 +263,7 @@
                 <w:color w:val="333333"/>
                 <w:sz w:val="18"/>
               </w:rPr>
-              <w:t>src/config/settings.py</w:t>
+              <w:t>python scripts/run_pipeline.py --mode standard</w:t>
             </w:r>
           </w:p>
         </w:tc>
@@ -287,7 +284,9 @@
                 <w:color w:val="333333"/>
                 <w:sz w:val="18"/>
               </w:rPr>
-              <w:t>Defines system paths, random seed (42), decision threshold (0.35), risk bands, and financial cost parameters.</w:t>
+              <w:t>python scripts/run_pipeline.py --mode production</w:t>
+              <w:br/>
+              <w:t>docker-compose up --build</w:t>
             </w:r>
           </w:p>
         </w:tc>
@@ -310,7 +309,7 @@
                 <w:color w:val="333333"/>
                 <w:sz w:val="18"/>
               </w:rPr>
-              <w:t>Data Contract &amp; Quality</w:t>
+              <w:t>API Security &amp; Auth</w:t>
             </w:r>
           </w:p>
         </w:tc>
@@ -331,9 +330,7 @@
                 <w:color w:val="333333"/>
                 <w:sz w:val="18"/>
               </w:rPr>
-              <w:t>src/data/data_contract.py</w:t>
-              <w:br/>
-              <w:t>src/data/validation.py</w:t>
+              <w:t>Disabled (Open REST endpoints)</w:t>
             </w:r>
           </w:p>
         </w:tc>
@@ -354,7 +351,7 @@
                 <w:color w:val="333333"/>
                 <w:sz w:val="18"/>
               </w:rPr>
-              <w:t>Enforces Pydantic TransactionSchema validation and performs automated data quality checks (nulls, duplicates, invalid values).</w:t>
+              <w:t>Enabled (Strict X-API-Key validation &amp; SHA-256 PII hashing)</w:t>
             </w:r>
           </w:p>
         </w:tc>
@@ -377,7 +374,7 @@
                 <w:color w:val="333333"/>
                 <w:sz w:val="18"/>
               </w:rPr>
-              <w:t>Leakage-Proof Preprocessing</w:t>
+              <w:t>Container Infrastructure</w:t>
             </w:r>
           </w:p>
         </w:tc>
@@ -398,7 +395,7 @@
                 <w:color w:val="333333"/>
                 <w:sz w:val="18"/>
               </w:rPr>
-              <w:t>src/preprocessing/preprocessor.py</w:t>
+              <w:t>Native Python environment</w:t>
             </w:r>
           </w:p>
         </w:tc>
@@ -419,7 +416,7 @@
                 <w:color w:val="333333"/>
                 <w:sz w:val="18"/>
               </w:rPr>
-              <w:t>Performs cleaning, binary search IP-to-country geolocation lookup, categorical encoding, and StandardScaler feature normalization.</w:t>
+              <w:t>Multi-container Docker Compose (API + Dashboard + Redis Cache)</w:t>
             </w:r>
           </w:p>
         </w:tc>
@@ -442,7 +439,7 @@
                 <w:color w:val="333333"/>
                 <w:sz w:val="18"/>
               </w:rPr>
-              <w:t>Feature Engineering</w:t>
+              <w:t>Monitoring &amp; Drift</w:t>
             </w:r>
           </w:p>
         </w:tc>
@@ -463,9 +460,7 @@
                 <w:color w:val="333333"/>
                 <w:sz w:val="18"/>
               </w:rPr>
-              <w:t>src/features/engineering.py</w:t>
-              <w:br/>
-              <w:t>src/features/registry.py</w:t>
+              <w:t>System telemetry &amp; basic metrics</w:t>
             </w:r>
           </w:p>
         </w:tc>
@@ -486,7 +481,7 @@
                 <w:color w:val="333333"/>
                 <w:sz w:val="18"/>
               </w:rPr>
-              <w:t>Extracts spending_speed, time_since_signup, is_new_user, is_rapid_spender, is_high_value, and maintains feature registry.</w:t>
+              <w:t>Population Stability Index (PSI) &amp; Kolmogorov-Smirnov feature drift audits</w:t>
             </w:r>
           </w:p>
         </w:tc>
@@ -509,7 +504,7 @@
                 <w:color w:val="333333"/>
                 <w:sz w:val="18"/>
               </w:rPr>
-              <w:t>Fraud Decision Engine</w:t>
+              <w:t>Feature Store &amp; Feedback</w:t>
             </w:r>
           </w:p>
         </w:tc>
@@ -530,9 +525,7 @@
                 <w:color w:val="333333"/>
                 <w:sz w:val="18"/>
               </w:rPr>
-              <w:t>src/decision/rules.py</w:t>
-              <w:br/>
-              <w:t>src/decision/risk_engine.py</w:t>
+              <w:t>In-memory feature registry</w:t>
             </w:r>
           </w:p>
         </w:tc>
@@ -553,74 +546,7 @@
                 <w:color w:val="333333"/>
                 <w:sz w:val="18"/>
               </w:rPr>
-              <w:t>Evaluates hard policy rules and model probabilities into ALLOW, REVIEW, or BLOCK decisions with risk bands and reason codes.</w:t>
-            </w:r>
-          </w:p>
-        </w:tc>
-      </w:tr>
-      <w:tr>
-        <w:tc>
-          <w:tcPr>
-            <w:tcW w:type="dxa" w:w="3120"/>
-            <w:shd w:fill="FFFFFF"/>
-            <w:tcMar>
-              <w:top w:w="100" w:type="dxa"/>
-              <w:bottom w:w="100" w:type="dxa"/>
-              <w:left w:w="100" w:type="dxa"/>
-              <w:right w:type="dxa" w:w="100"/>
-            </w:tcMar>
-          </w:tcPr>
-          <w:p>
-            <w:r>
-              <w:rPr>
-                <w:color w:val="333333"/>
-                <w:sz w:val="18"/>
-              </w:rPr>
-              <w:t>REST API &amp; Explainability</w:t>
-            </w:r>
-          </w:p>
-        </w:tc>
-        <w:tc>
-          <w:tcPr>
-            <w:tcW w:type="dxa" w:w="3120"/>
-            <w:shd w:fill="FFFFFF"/>
-            <w:tcMar>
-              <w:top w:w="100" w:type="dxa"/>
-              <w:bottom w:w="100" w:type="dxa"/>
-              <w:left w:w="100" w:type="dxa"/>
-              <w:right w:type="dxa" w:w="100"/>
-            </w:tcMar>
-          </w:tcPr>
-          <w:p>
-            <w:r>
-              <w:rPr>
-                <w:color w:val="333333"/>
-                <w:sz w:val="18"/>
-              </w:rPr>
-              <w:t>src/api/main.py</w:t>
-              <w:br/>
-              <w:t>src/explainability/shap_explainer.py</w:t>
-            </w:r>
-          </w:p>
-        </w:tc>
-        <w:tc>
-          <w:tcPr>
-            <w:tcW w:type="dxa" w:w="3120"/>
-            <w:shd w:fill="FFFFFF"/>
-            <w:tcMar>
-              <w:top w:w="100" w:type="dxa"/>
-              <w:bottom w:w="100" w:type="dxa"/>
-              <w:left w:w="100" w:type="dxa"/>
-              <w:right w:type="dxa" w:w="100"/>
-            </w:tcMar>
-          </w:tcPr>
-          <w:p>
-            <w:r>
-              <w:rPr>
-                <w:color w:val="333333"/>
-                <w:sz w:val="18"/>
-              </w:rPr>
-              <w:t>FastAPI microservice serving /predict and /predict/batch requests with SHAP feature contribution explanations.</w:t>
+              <w:t>Feast/Redis online feature store + Analyst active learning review store</w:t>
             </w:r>
           </w:p>
         </w:tc>
@@ -643,156 +569,7 @@
           <w:color w:val="1B365D"/>
           <w:sz w:val="36"/>
         </w:rPr>
-        <w:t>3. Detailed System Capabilities</w:t>
-      </w:r>
-    </w:p>
-    <w:p>
-      <w:pPr>
-        <w:pStyle w:val="Heading2"/>
-        <w:keepNext/>
-        <w:spacing w:before="280" w:after="120"/>
-      </w:pPr>
-      <w:r>
-        <w:rPr>
-          <w:b/>
-          <w:color w:val="006699"/>
-          <w:sz w:val="28"/>
-        </w:rPr>
-        <w:t>3.1 Automated Fraud Decision Engine</w:t>
-      </w:r>
-    </w:p>
-    <w:p>
-      <w:pPr>
-        <w:spacing w:line="276" w:lineRule="auto"/>
-      </w:pPr>
-      <w:r>
-        <w:t>The decision engine moves beyond returning a simple probability by wrapping model inference with configurable business policy rules:</w:t>
-        <w:br/>
-        <w:t>• ALLOW: Low probability (&lt; 0.35) and no policy rule violations.</w:t>
-        <w:br/>
-        <w:t>• REVIEW: Medium-to-high risk (0.35 - 0.70) or non-critical policy triggers; routed to human analyst queue.</w:t>
-        <w:br/>
-        <w:t>• BLOCK: High probability (&gt;= 0.70) or hard rule triggers (e.g. instant purchase &lt; 6 minutes after signup or extreme velocity &gt; 20.0).</w:t>
-        <w:br/>
-        <w:br/>
-        <w:t>Risk Bands: Assigned dynamically as LOW (0.0-0.2), MEDIUM (0.2-0.5), HIGH (0.5-0.8), or CRITICAL (0.8-1.0).</w:t>
-      </w:r>
-    </w:p>
-    <w:p>
-      <w:pPr>
-        <w:pStyle w:val="Heading2"/>
-        <w:keepNext/>
-        <w:spacing w:before="280" w:after="120"/>
-      </w:pPr>
-      <w:r>
-        <w:rPr>
-          <w:b/>
-          <w:color w:val="006699"/>
-          <w:sz w:val="28"/>
-        </w:rPr>
-        <w:t>3.2 Production FastAPI REST Microservice</w:t>
-      </w:r>
-    </w:p>
-    <w:p>
-      <w:pPr>
-        <w:spacing w:line="276" w:lineRule="auto"/>
-      </w:pPr>
-      <w:r>
-        <w:t>Built using FastAPI and Uvicorn, the API provides high-throughput real-time inference endpoints:</w:t>
-        <w:br/>
-        <w:t>• POST /predict: Accepts a single transaction JSON payload; returns score, decision, risk band, and top SHAP risk factors.</w:t>
-        <w:br/>
-        <w:t>• POST /predict/batch: Scores an array of transaction payloads in a single request.</w:t>
-        <w:br/>
-        <w:t>• GET /health &amp; GET /ready: Microservice health check and model loading verification.</w:t>
-        <w:br/>
-        <w:t>• GET /model/info: Exposes active model version, decision threshold, and feature schema.</w:t>
-      </w:r>
-    </w:p>
-    <w:p>
-      <w:pPr>
-        <w:pStyle w:val="Heading2"/>
-        <w:keepNext/>
-        <w:spacing w:before="280" w:after="120"/>
-      </w:pPr>
-      <w:r>
-        <w:rPr>
-          <w:b/>
-          <w:color w:val="006699"/>
-          <w:sz w:val="28"/>
-        </w:rPr>
-        <w:t>3.3 Multi-Page Control Dashboard</w:t>
-      </w:r>
-    </w:p>
-    <w:p>
-      <w:pPr>
-        <w:spacing w:line="276" w:lineRule="auto"/>
-      </w:pPr>
-      <w:r>
-        <w:t>The Streamlit dashboard features a multi-page architecture with dataset caching (@st.cache_data):</w:t>
-        <w:br/>
-        <w:t>1. Overview: High-level dataset metrics, class distributions, and purchase value histograms.</w:t>
-        <w:br/>
-        <w:t>2. Fraud Alerts: Real-time alert stream table with interactive filters for BLOCK and REVIEW decisions.</w:t>
-        <w:br/>
-        <w:t>3. Transaction Investigation: Live CSV file upload scoring and single-transaction inspector with SHAP impact bar charts.</w:t>
-        <w:br/>
-        <w:t>4. Model Performance: AUC-PR, ROC-AUC, confusion matrix, threshold tuning slider, and cost analysis.</w:t>
-        <w:br/>
-        <w:t>5. Data Quality: Schema validation status, null counts, duplicate records, and invalid amount reports.</w:t>
-        <w:br/>
-        <w:t>6. System Health: Service uptime, request telemetry, and model artifact metadata.</w:t>
-      </w:r>
-    </w:p>
-    <w:p>
-      <w:pPr>
-        <w:pStyle w:val="Heading1"/>
-        <w:keepNext/>
-        <w:spacing w:before="280" w:after="120"/>
-      </w:pPr>
-      <w:r>
-        <w:rPr>
-          <w:b/>
-          <w:color w:val="1B365D"/>
-          <w:sz w:val="36"/>
-        </w:rPr>
-        <w:t>4. Financial Cost-Sensitive Evaluation Framework</w:t>
-      </w:r>
-    </w:p>
-    <w:p>
-      <w:pPr>
-        <w:spacing w:line="276" w:lineRule="auto"/>
-      </w:pPr>
-      <w:r>
-        <w:t>The system evaluates model performance using business cost metrics in addition to traditional statistical metrics:</w:t>
-        <w:br/>
-        <w:br/>
-        <w:t>Total Cost = (FP × Cost_FP) + (FN × Cost_FN) + ((FP + TP) × Cost_Review)</w:t>
-        <w:br/>
-        <w:br/>
-        <w:t>• Cost_FP ($10.00): Customer friction &amp; false positive notification cost.</w:t>
-        <w:br/>
-        <w:t>• Cost_FN ($150.00): Direct financial loss from uncaptured fraud.</w:t>
-        <w:br/>
-        <w:t>• Cost_Review ($5.00): Manual analyst investigation cost.</w:t>
-        <w:br/>
-        <w:br/>
-        <w:t>Net Savings = Baseline Loss - Total Cost</w:t>
-      </w:r>
-    </w:p>
-    <w:p>
-      <w:pPr>
-        <w:pStyle w:val="Heading1"/>
-        <w:keepNext/>
-        <w:spacing w:before="280" w:after="120"/>
-      </w:pPr>
-      <w:r>
-        <w:rPr>
-          <w:b/>
-          <w:color w:val="1B365D"/>
-          <w:sz w:val="36"/>
-        </w:rPr>
-        <w:t>5. System Execution Commands</w:t>
+        <w:t>3. Execution Commands Guide</w:t>
       </w:r>
     </w:p>
     <w:p>
@@ -828,24 +605,20 @@
                 <w:color w:val="111111"/>
                 <w:sz w:val="18"/>
               </w:rPr>
-              <w:t># 1. Run End-to-End Orchestrator Pipeline</w:t>
+              <w:t># --- OPTION 1: STANDARD LOCAL ML PIPELINE ---</w:t>
               <w:br/>
-              <w:t>python scripts/run_pipeline.py</w:t>
-              <w:br/>
-              <w:br/>
-              <w:t># 2. Run Pytest Automated Validation Suite</w:t>
+              <w:t>python scripts/run_pipeline.py --mode standard</w:t>
               <w:br/>
               <w:t>python -m pytest tests/ -v</w:t>
               <w:br/>
-              <w:br/>
-              <w:t># 3. Launch FastAPI REST Service (http://127.0.0.1:8000)</w:t>
-              <w:br/>
-              <w:t>uvicorn src.api.main:app --reload --port 8000</w:t>
+              <w:t>streamlit run dashboard/app.py</w:t>
               <w:br/>
               <w:br/>
-              <w:t># 4. Launch Multi-Page Streamlit Dashboard</w:t>
+              <w:t># --- OPTION 2: ENTERPRISE PRODUCTION STACK ---</w:t>
               <w:br/>
-              <w:t>streamlit run dashboard/app.py</w:t>
+              <w:t>python scripts/run_pipeline.py --mode production</w:t>
+              <w:br/>
+              <w:t>docker-compose up --build</w:t>
               <w:br/>
             </w:r>
           </w:p>
@@ -867,7 +640,7 @@
           <w:color w:val="888888"/>
           <w:sz w:val="20"/>
         </w:rPr>
-        <w:t>--- End of Technical Architecture Document | Adey Innovations Inc. ---</w:t>
+        <w:t>--- End of Technical Specification Document | Adey Innovations Inc. ---</w:t>
       </w:r>
     </w:p>
     <w:sectPr>

</xml_diff>